<commit_message>
fix modele 3 word
</commit_message>
<xml_diff>
--- a/public/assets/modele/modele3grand.docx
+++ b/public/assets/modele/modele3grand.docx
@@ -25,7 +25,7 @@
           <w:lang w:val="fr-FR"/>
         </w:rPr>
         <w:drawing>
-          <wp:anchor distT="0" distB="0" distL="114300" distR="114300" simplePos="0" relativeHeight="251658240" behindDoc="1" locked="0" layoutInCell="1" allowOverlap="1" wp14:anchorId="4099FAF8" wp14:editId="15395482">
+          <wp:anchor distT="0" distB="0" distL="114300" distR="114300" simplePos="0" relativeHeight="251658240" behindDoc="1" locked="0" layoutInCell="1" allowOverlap="1" wp14:anchorId="4099FAF8" wp14:editId="74BA904F">
             <wp:simplePos x="0" y="0"/>
             <wp:positionH relativeFrom="page">
               <wp:align>left</wp:align>
@@ -205,6 +205,315 @@
           <w:lang w:val="fr-FR"/>
         </w:rPr>
       </w:pPr>
+      <w:r>
+        <w:rPr>
+          <w:rFonts w:ascii="Shlomo Stam" w:hAnsi="Shlomo Stam" w:cs="Shlomo Stam"/>
+          <w:noProof/>
+          <w:spacing w:val="4"/>
+          <w:sz w:val="36"/>
+          <w:szCs w:val="36"/>
+          <w:lang w:val="fr-FR"/>
+        </w:rPr>
+        <mc:AlternateContent>
+          <mc:Choice Requires="wps">
+            <w:drawing>
+              <wp:anchor distT="0" distB="0" distL="114300" distR="114300" simplePos="0" relativeHeight="251662336" behindDoc="0" locked="0" layoutInCell="1" allowOverlap="1" wp14:anchorId="0501D45A" wp14:editId="422E9C54">
+                <wp:simplePos x="0" y="0"/>
+                <wp:positionH relativeFrom="column">
+                  <wp:posOffset>7117764</wp:posOffset>
+                </wp:positionH>
+                <wp:positionV relativeFrom="paragraph">
+                  <wp:posOffset>3956001</wp:posOffset>
+                </wp:positionV>
+                <wp:extent cx="319454" cy="134816"/>
+                <wp:effectExtent l="0" t="0" r="4445" b="0"/>
+                <wp:wrapNone/>
+                <wp:docPr id="816474994" name="Zone de texte 4"/>
+                <wp:cNvGraphicFramePr/>
+                <a:graphic xmlns:a="http://schemas.openxmlformats.org/drawingml/2006/main">
+                  <a:graphicData uri="http://schemas.microsoft.com/office/word/2010/wordprocessingShape">
+                    <wps:wsp>
+                      <wps:cNvSpPr txBox="1"/>
+                      <wps:spPr>
+                        <a:xfrm>
+                          <a:off x="0" y="0"/>
+                          <a:ext cx="319454" cy="134816"/>
+                        </a:xfrm>
+                        <a:prstGeom prst="rect">
+                          <a:avLst/>
+                        </a:prstGeom>
+                        <a:solidFill>
+                          <a:schemeClr val="lt1"/>
+                        </a:solidFill>
+                        <a:ln w="6350">
+                          <a:noFill/>
+                        </a:ln>
+                      </wps:spPr>
+                      <wps:txbx>
+                        <w:txbxContent>
+                          <w:p/>
+                        </w:txbxContent>
+                      </wps:txbx>
+                      <wps:bodyPr rot="0" spcFirstLastPara="0" vertOverflow="overflow" horzOverflow="overflow" vert="horz" wrap="square" lIns="91440" tIns="45720" rIns="91440" bIns="45720" numCol="1" spcCol="0" rtlCol="0" fromWordArt="0" anchor="t" anchorCtr="0" forceAA="0" compatLnSpc="1">
+                        <a:prstTxWarp prst="textNoShape">
+                          <a:avLst/>
+                        </a:prstTxWarp>
+                        <a:noAutofit/>
+                      </wps:bodyPr>
+                    </wps:wsp>
+                  </a:graphicData>
+                </a:graphic>
+              </wp:anchor>
+            </w:drawing>
+          </mc:Choice>
+          <mc:Fallback>
+            <w:pict>
+              <v:shapetype w14:anchorId="0501D45A" id="_x0000_t202" coordsize="21600,21600" o:spt="202" path="m,l,21600r21600,l21600,xe">
+                <v:stroke joinstyle="miter"/>
+                <v:path gradientshapeok="t" o:connecttype="rect"/>
+              </v:shapetype>
+              <v:shape id="Zone de texte 4" o:spid="_x0000_s1026" type="#_x0000_t202" style="position:absolute;margin-left:560.45pt;margin-top:311.5pt;width:25.15pt;height:10.6pt;z-index:251662336;visibility:visible;mso-wrap-style:square;mso-wrap-distance-left:9pt;mso-wrap-distance-top:0;mso-wrap-distance-right:9pt;mso-wrap-distance-bottom:0;mso-position-horizontal:absolute;mso-position-horizontal-relative:text;mso-position-vertical:absolute;mso-position-vertical-relative:text;v-text-anchor:top" o:gfxdata="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" fillcolor="white [3201]" stroked="f" strokeweight=".5pt">
+                <v:textbox>
+                  <w:txbxContent>
+                    <w:p/>
+                  </w:txbxContent>
+                </v:textbox>
+              </v:shape>
+            </w:pict>
+          </mc:Fallback>
+        </mc:AlternateContent>
+      </w:r>
+      <w:r>
+        <w:rPr>
+          <w:rFonts w:ascii="Shlomo Stam" w:hAnsi="Shlomo Stam" w:cs="Shlomo Stam"/>
+          <w:noProof/>
+          <w:spacing w:val="4"/>
+          <w:sz w:val="36"/>
+          <w:szCs w:val="36"/>
+          <w:lang w:val="fr-FR"/>
+        </w:rPr>
+        <mc:AlternateContent>
+          <mc:Choice Requires="wps">
+            <w:drawing>
+              <wp:anchor distT="0" distB="0" distL="114300" distR="114300" simplePos="0" relativeHeight="251661312" behindDoc="0" locked="0" layoutInCell="1" allowOverlap="1" wp14:anchorId="4D51BD63" wp14:editId="441603ED">
+                <wp:simplePos x="0" y="0"/>
+                <wp:positionH relativeFrom="column">
+                  <wp:posOffset>-53828</wp:posOffset>
+                </wp:positionH>
+                <wp:positionV relativeFrom="paragraph">
+                  <wp:posOffset>3956001</wp:posOffset>
+                </wp:positionV>
+                <wp:extent cx="313103" cy="146539"/>
+                <wp:effectExtent l="0" t="0" r="0" b="6350"/>
+                <wp:wrapNone/>
+                <wp:docPr id="904495494" name="Zone de texte 3"/>
+                <wp:cNvGraphicFramePr/>
+                <a:graphic xmlns:a="http://schemas.openxmlformats.org/drawingml/2006/main">
+                  <a:graphicData uri="http://schemas.microsoft.com/office/word/2010/wordprocessingShape">
+                    <wps:wsp>
+                      <wps:cNvSpPr txBox="1"/>
+                      <wps:spPr>
+                        <a:xfrm>
+                          <a:off x="0" y="0"/>
+                          <a:ext cx="313103" cy="146539"/>
+                        </a:xfrm>
+                        <a:prstGeom prst="rect">
+                          <a:avLst/>
+                        </a:prstGeom>
+                        <a:solidFill>
+                          <a:schemeClr val="lt1"/>
+                        </a:solidFill>
+                        <a:ln w="6350">
+                          <a:noFill/>
+                        </a:ln>
+                      </wps:spPr>
+                      <wps:txbx>
+                        <w:txbxContent>
+                          <w:p/>
+                        </w:txbxContent>
+                      </wps:txbx>
+                      <wps:bodyPr rot="0" spcFirstLastPara="0" vertOverflow="overflow" horzOverflow="overflow" vert="horz" wrap="square" lIns="91440" tIns="45720" rIns="91440" bIns="45720" numCol="1" spcCol="0" rtlCol="0" fromWordArt="0" anchor="t" anchorCtr="0" forceAA="0" compatLnSpc="1">
+                        <a:prstTxWarp prst="textNoShape">
+                          <a:avLst/>
+                        </a:prstTxWarp>
+                        <a:noAutofit/>
+                      </wps:bodyPr>
+                    </wps:wsp>
+                  </a:graphicData>
+                </a:graphic>
+                <wp14:sizeRelH relativeFrom="margin">
+                  <wp14:pctWidth>0</wp14:pctWidth>
+                </wp14:sizeRelH>
+              </wp:anchor>
+            </w:drawing>
+          </mc:Choice>
+          <mc:Fallback>
+            <w:pict>
+              <v:shape w14:anchorId="4D51BD63" id="Zone de texte 3" o:spid="_x0000_s1027" type="#_x0000_t202" style="position:absolute;margin-left:-4.25pt;margin-top:311.5pt;width:24.65pt;height:11.55pt;z-index:251661312;visibility:visible;mso-wrap-style:square;mso-width-percent:0;mso-wrap-distance-left:9pt;mso-wrap-distance-top:0;mso-wrap-distance-right:9pt;mso-wrap-distance-bottom:0;mso-position-horizontal:absolute;mso-position-horizontal-relative:text;mso-position-vertical:absolute;mso-position-vertical-relative:text;mso-width-percent:0;mso-width-relative:margin;v-text-anchor:top" o:gfxdata="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" fillcolor="white [3201]" stroked="f" strokeweight=".5pt">
+                <v:textbox>
+                  <w:txbxContent>
+                    <w:p/>
+                  </w:txbxContent>
+                </v:textbox>
+              </v:shape>
+            </w:pict>
+          </mc:Fallback>
+        </mc:AlternateContent>
+      </w:r>
+      <w:r>
+        <w:rPr>
+          <w:rFonts w:ascii="Shlomo Stam" w:hAnsi="Shlomo Stam" w:cs="Shlomo Stam"/>
+          <w:noProof/>
+          <w:spacing w:val="4"/>
+          <w:sz w:val="36"/>
+          <w:szCs w:val="36"/>
+          <w:lang w:val="fr-FR"/>
+        </w:rPr>
+        <mc:AlternateContent>
+          <mc:Choice Requires="wps">
+            <w:drawing>
+              <wp:anchor distT="0" distB="0" distL="114300" distR="114300" simplePos="0" relativeHeight="251660288" behindDoc="0" locked="0" layoutInCell="1" allowOverlap="1" wp14:anchorId="0E9116DC" wp14:editId="7D4F65A4">
+                <wp:simplePos x="0" y="0"/>
+                <wp:positionH relativeFrom="column">
+                  <wp:posOffset>7141210</wp:posOffset>
+                </wp:positionH>
+                <wp:positionV relativeFrom="paragraph">
+                  <wp:posOffset>1143635</wp:posOffset>
+                </wp:positionV>
+                <wp:extent cx="205740" cy="198120"/>
+                <wp:effectExtent l="0" t="0" r="3810" b="0"/>
+                <wp:wrapNone/>
+                <wp:docPr id="1188998195" name="Zone de texte 2"/>
+                <wp:cNvGraphicFramePr/>
+                <a:graphic xmlns:a="http://schemas.openxmlformats.org/drawingml/2006/main">
+                  <a:graphicData uri="http://schemas.microsoft.com/office/word/2010/wordprocessingShape">
+                    <wps:wsp>
+                      <wps:cNvSpPr txBox="1"/>
+                      <wps:spPr>
+                        <a:xfrm>
+                          <a:off x="0" y="0"/>
+                          <a:ext cx="205740" cy="198120"/>
+                        </a:xfrm>
+                        <a:prstGeom prst="rect">
+                          <a:avLst/>
+                        </a:prstGeom>
+                        <a:solidFill>
+                          <a:schemeClr val="lt1"/>
+                        </a:solidFill>
+                        <a:ln w="6350">
+                          <a:noFill/>
+                        </a:ln>
+                      </wps:spPr>
+                      <wps:txbx>
+                        <w:txbxContent>
+                          <w:p/>
+                        </w:txbxContent>
+                      </wps:txbx>
+                      <wps:bodyPr rot="0" spcFirstLastPara="0" vertOverflow="overflow" horzOverflow="overflow" vert="horz" wrap="square" lIns="91440" tIns="45720" rIns="91440" bIns="45720" numCol="1" spcCol="0" rtlCol="0" fromWordArt="0" anchor="t" anchorCtr="0" forceAA="0" compatLnSpc="1">
+                        <a:prstTxWarp prst="textNoShape">
+                          <a:avLst/>
+                        </a:prstTxWarp>
+                        <a:noAutofit/>
+                      </wps:bodyPr>
+                    </wps:wsp>
+                  </a:graphicData>
+                </a:graphic>
+              </wp:anchor>
+            </w:drawing>
+          </mc:Choice>
+          <mc:Fallback>
+            <w:pict>
+              <v:shape w14:anchorId="0E9116DC" id="Zone de texte 2" o:spid="_x0000_s1028" type="#_x0000_t202" style="position:absolute;margin-left:562.3pt;margin-top:90.05pt;width:16.2pt;height:15.6pt;z-index:251660288;visibility:visible;mso-wrap-style:square;mso-wrap-distance-left:9pt;mso-wrap-distance-top:0;mso-wrap-distance-right:9pt;mso-wrap-distance-bottom:0;mso-position-horizontal:absolute;mso-position-horizontal-relative:text;mso-position-vertical:absolute;mso-position-vertical-relative:text;v-text-anchor:top" o:gfxdata="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" fillcolor="white [3201]" stroked="f" strokeweight=".5pt">
+                <v:textbox>
+                  <w:txbxContent>
+                    <w:p/>
+                  </w:txbxContent>
+                </v:textbox>
+              </v:shape>
+            </w:pict>
+          </mc:Fallback>
+        </mc:AlternateContent>
+      </w:r>
+      <w:r>
+        <w:rPr>
+          <w:rFonts w:ascii="Shlomo Stam" w:hAnsi="Shlomo Stam" w:cs="Shlomo Stam"/>
+          <w:noProof/>
+          <w:spacing w:val="4"/>
+          <w:sz w:val="36"/>
+          <w:szCs w:val="36"/>
+          <w:lang w:val="fr-FR"/>
+        </w:rPr>
+        <mc:AlternateContent>
+          <mc:Choice Requires="wps">
+            <w:drawing>
+              <wp:anchor distT="0" distB="0" distL="114300" distR="114300" simplePos="0" relativeHeight="251659264" behindDoc="0" locked="0" layoutInCell="1" allowOverlap="1" wp14:anchorId="7F436513" wp14:editId="5ADD899B">
+                <wp:simplePos x="0" y="0"/>
+                <wp:positionH relativeFrom="column">
+                  <wp:posOffset>31750</wp:posOffset>
+                </wp:positionH>
+                <wp:positionV relativeFrom="paragraph">
+                  <wp:posOffset>1158875</wp:posOffset>
+                </wp:positionV>
+                <wp:extent cx="176400" cy="169200"/>
+                <wp:effectExtent l="0" t="0" r="0" b="2540"/>
+                <wp:wrapNone/>
+                <wp:docPr id="1615652685" name="Zone de texte 1"/>
+                <wp:cNvGraphicFramePr/>
+                <a:graphic xmlns:a="http://schemas.openxmlformats.org/drawingml/2006/main">
+                  <a:graphicData uri="http://schemas.microsoft.com/office/word/2010/wordprocessingShape">
+                    <wps:wsp>
+                      <wps:cNvSpPr txBox="1"/>
+                      <wps:spPr>
+                        <a:xfrm>
+                          <a:off x="0" y="0"/>
+                          <a:ext cx="176400" cy="169200"/>
+                        </a:xfrm>
+                        <a:prstGeom prst="rect">
+                          <a:avLst/>
+                        </a:prstGeom>
+                        <a:solidFill>
+                          <a:schemeClr val="lt1"/>
+                        </a:solidFill>
+                        <a:ln w="6350">
+                          <a:noFill/>
+                        </a:ln>
+                      </wps:spPr>
+                      <wps:txbx>
+                        <w:txbxContent>
+                          <w:p/>
+                        </w:txbxContent>
+                      </wps:txbx>
+                      <wps:bodyPr rot="0" spcFirstLastPara="0" vertOverflow="overflow" horzOverflow="overflow" vert="horz" wrap="square" lIns="91440" tIns="45720" rIns="91440" bIns="45720" numCol="1" spcCol="0" rtlCol="0" fromWordArt="0" anchor="t" anchorCtr="0" forceAA="0" compatLnSpc="1">
+                        <a:prstTxWarp prst="textNoShape">
+                          <a:avLst/>
+                        </a:prstTxWarp>
+                        <a:noAutofit/>
+                      </wps:bodyPr>
+                    </wps:wsp>
+                  </a:graphicData>
+                </a:graphic>
+                <wp14:sizeRelH relativeFrom="margin">
+                  <wp14:pctWidth>0</wp14:pctWidth>
+                </wp14:sizeRelH>
+                <wp14:sizeRelV relativeFrom="margin">
+                  <wp14:pctHeight>0</wp14:pctHeight>
+                </wp14:sizeRelV>
+              </wp:anchor>
+            </w:drawing>
+          </mc:Choice>
+          <mc:Fallback>
+            <w:pict>
+              <v:shape w14:anchorId="7F436513" id="Zone de texte 1" o:spid="_x0000_s1029" type="#_x0000_t202" style="position:absolute;margin-left:2.5pt;margin-top:91.25pt;width:13.9pt;height:13.3pt;z-index:251659264;visibility:visible;mso-wrap-style:square;mso-width-percent:0;mso-height-percent:0;mso-wrap-distance-left:9pt;mso-wrap-distance-top:0;mso-wrap-distance-right:9pt;mso-wrap-distance-bottom:0;mso-position-horizontal:absolute;mso-position-horizontal-relative:text;mso-position-vertical:absolute;mso-position-vertical-relative:text;mso-width-percent:0;mso-height-percent:0;mso-width-relative:margin;mso-height-relative:margin;v-text-anchor:top" o:gfxdata="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" fillcolor="white [3201]" stroked="f" strokeweight=".5pt">
+                <v:textbox>
+                  <w:txbxContent>
+                    <w:p/>
+                  </w:txbxContent>
+                </v:textbox>
+              </v:shape>
+            </w:pict>
+          </mc:Fallback>
+        </mc:AlternateContent>
+      </w:r>
       <w:r>
         <w:rPr>
           <w:rFonts w:ascii="Shlomo Stam" w:hAnsi="Shlomo Stam" w:cs="Shlomo Stam"/>

</xml_diff>